<commit_message>
docs(lab04): instrumento ABET del Laboratorio 04 (MoveIt 2 con ejecución supervisada)
Instrumento de entrega y evaluación con el formato de los laboratorios
anteriores: identificación (Tercer Corte, C3_L04_...), parámetros de
assessment, niveles N1-N5, alineación C1-C5 con SO e indicadores de la
guía, evidencias E1-E9, Tablas 1 a 6 de la guía, cuestionario con los
análisis, preguntas de discusión y conclusiones, Anexo A, rúbricas y
consolidación ABET (L3).

El Markdown es la fuente; build_instrumento_lab_04.py reutiliza el
conversor del instrumento IA 01, cuyos metadatos del Word pasan a ser
parámetros. El analizador de tablas trata «\|» como barra literal: la
fila de la versión de MoveIt en la guía del Lab 04 salía partida.

La guía del Lab 04 cita el instrumento como formato de entrega
(secciones 5.2 y 8) y se indexa en education/README.md.

Co-Authored-By: Claude Opus 5.5 <noreply@anthropic.com>
Claude-Session: https://claude.ai/code/session_01A4jArrxa1RLtDdQTQFnPXP
</commit_message>
<xml_diff>
--- a/education/guias_laboratorio/GUIA_LAB_04_MOVEIT2_EJECUCION_SEGURA.docx
+++ b/education/guias_laboratorio/GUIA_LAB_04_MOVEIT2_EJECUCION_SEGURA.docx
@@ -889,6 +889,7 @@
                 <w:b w:val="0"/>
                 <w:sz w:val="16"/>
               </w:rPr>
+              <w:t>Instrumento ABET de entrega</w:t>
             </w:r>
           </w:p>
         </w:tc>
@@ -918,6 +919,7 @@
                 <w:b w:val="0"/>
                 <w:sz w:val="16"/>
               </w:rPr>
+              <w:t>Se crea INSTRUMENTO_ABET_LAB_04_MOVEIT2_EJECUCION_SEGURA (Markdown y Word) con las Tablas 1 a 6, las evidencias E1 a E9, el cuestionario, el Anexo A y las rúbricas de C1 a C5. Las secciones 5.2 y 8 lo citan como formato de entrega.</w:t>
             </w:r>
           </w:p>
         </w:tc>
@@ -948,6 +950,7 @@
                 <w:b w:val="0"/>
                 <w:sz w:val="16"/>
               </w:rPr>
+              <w:t>21/10/2026</w:t>
             </w:r>
           </w:p>
         </w:tc>
@@ -7184,7 +7187,7 @@
                 <w:b w:val="0"/>
                 <w:sz w:val="16"/>
               </w:rPr>
-              <w:t>Instrumento de entrega del laboratorio (DOCX)</w:t>
+              <w:t>Instrumento de entrega del laboratorio (DOCX) con las Tablas 1 a 6, más los registros .jsonl</w:t>
             </w:r>
           </w:p>
         </w:tc>
@@ -8457,6 +8460,7 @@
                 <w:color w:val="FFFFFF"/>
                 <w:sz w:val="16"/>
               </w:rPr>
+              <w:t>N.º</w:t>
             </w:r>
           </w:p>
         </w:tc>
@@ -9924,7 +9928,7 @@
           <w:i w:val="0"/>
           <w:sz w:val="18"/>
         </w:rPr>
-        <w:t>Las tablas se diligencian en el instrumento de entrega. Aquí se reproducen como referencia para la sesión.</w:t>
+        <w:t>Las tablas se diligencian en el instrumento de entrega, INSTRUMENTO_ABET_LAB_04_MOVEIT2_EJECUCION_SEGURA.docx, que se entrega como C3_L04_G&lt;grupo&gt;_&lt;codigo1&gt;_&lt;codigo2&gt;_v1.docx. Con él se adjuntan metas_eqNN.yaml, los archivos seco.jsonl, fake.jsonl y real.jsonl que escribe el ejecutor (report_file) y la salida de ros2 bag info de la bolsa de la Fase 6. Aquí se reproducen como referencia para la sesión.</w:t>
       </w:r>
     </w:p>
     <w:p>
@@ -9958,9 +9962,8 @@
         <w:tblLook w:val="04A0" w:firstRow="1" w:lastRow="0" w:firstColumn="1" w:lastColumn="0" w:noHBand="0" w:noVBand="1"/>
       </w:tblPr>
       <w:tblGrid>
-        <w:gridCol w:w="4139"/>
-        <w:gridCol w:w="2194"/>
-        <w:gridCol w:w="3311"/>
+        <w:gridCol w:w="5352"/>
+        <w:gridCol w:w="4286"/>
       </w:tblGrid>
       <w:tr>
         <w:trPr>
@@ -9969,7 +9972,7 @@
         </w:trPr>
         <w:tc>
           <w:tcPr>
-            <w:tcW w:type="dxa" w:w="4139"/>
+            <w:tcW w:type="dxa" w:w="5352"/>
             <w:tcMar>
               <w:top w:w="90" w:type="dxa"/>
               <w:start w:w="90" w:type="dxa"/>
@@ -9998,7 +10001,7 @@
         </w:tc>
         <w:tc>
           <w:tcPr>
-            <w:tcW w:type="dxa" w:w="2194"/>
+            <w:tcW w:type="dxa" w:w="4286"/>
             <w:tcMar>
               <w:top w:w="90" w:type="dxa"/>
               <w:start w:w="90" w:type="dxa"/>
@@ -10022,34 +10025,6 @@
                 <w:sz w:val="16"/>
               </w:rPr>
               <w:t>Valor</w:t>
-            </w:r>
-          </w:p>
-        </w:tc>
-        <w:tc>
-          <w:tcPr>
-            <w:tcW w:type="dxa" w:w="3311"/>
-            <w:tcMar>
-              <w:top w:w="90" w:type="dxa"/>
-              <w:start w:w="90" w:type="dxa"/>
-              <w:bottom w:w="90" w:type="dxa"/>
-              <w:end w:w="90" w:type="dxa"/>
-            </w:tcMar>
-            <w:shd w:fill="1F4E79"/>
-            <w:vAlign w:val="center"/>
-          </w:tcPr>
-          <w:p>
-            <w:pPr>
-              <w:spacing w:after="0" w:before="0"/>
-              <w:jc w:val="center"/>
-            </w:pPr>
-            <w:r/>
-            <w:r>
-              <w:rPr>
-                <w:rFonts w:ascii="Arial" w:hAnsi="Arial"/>
-                <w:b/>
-                <w:color w:val="FFFFFF"/>
-                <w:sz w:val="16"/>
-              </w:rPr>
             </w:r>
           </w:p>
         </w:tc>
@@ -10060,7 +10035,7 @@
         </w:trPr>
         <w:tc>
           <w:tcPr>
-            <w:tcW w:type="dxa" w:w="4139"/>
+            <w:tcW w:type="dxa" w:w="5352"/>
             <w:tcMar>
               <w:top w:w="90" w:type="dxa"/>
               <w:start w:w="90" w:type="dxa"/>
@@ -10087,33 +10062,7 @@
         </w:tc>
         <w:tc>
           <w:tcPr>
-            <w:tcW w:type="dxa" w:w="2194"/>
-            <w:tcMar>
-              <w:top w:w="90" w:type="dxa"/>
-              <w:start w:w="90" w:type="dxa"/>
-              <w:bottom w:w="90" w:type="dxa"/>
-              <w:end w:w="90" w:type="dxa"/>
-            </w:tcMar>
-            <w:vAlign w:val="center"/>
-          </w:tcPr>
-          <w:p>
-            <w:pPr>
-              <w:spacing w:after="0" w:before="0"/>
-              <w:jc w:val="left"/>
-            </w:pPr>
-            <w:r/>
-            <w:r>
-              <w:rPr>
-                <w:rFonts w:ascii="Arial" w:hAnsi="Arial"/>
-                <w:b w:val="0"/>
-                <w:sz w:val="16"/>
-              </w:rPr>
-            </w:r>
-          </w:p>
-        </w:tc>
-        <w:tc>
-          <w:tcPr>
-            <w:tcW w:type="dxa" w:w="3311"/>
+            <w:tcW w:type="dxa" w:w="4286"/>
             <w:tcMar>
               <w:top w:w="90" w:type="dxa"/>
               <w:start w:w="90" w:type="dxa"/>
@@ -10144,7 +10093,7 @@
         </w:trPr>
         <w:tc>
           <w:tcPr>
-            <w:tcW w:type="dxa" w:w="4139"/>
+            <w:tcW w:type="dxa" w:w="5352"/>
             <w:tcMar>
               <w:top w:w="90" w:type="dxa"/>
               <w:start w:w="90" w:type="dxa"/>
@@ -10166,41 +10115,13 @@
                 <w:b w:val="0"/>
                 <w:sz w:val="16"/>
               </w:rPr>
-              <w:t>Versión de MoveIt (ros2 pkg xml moveit_ros_move_group \</w:t>
-            </w:r>
-          </w:p>
-        </w:tc>
-        <w:tc>
-          <w:tcPr>
-            <w:tcW w:type="dxa" w:w="2194"/>
-            <w:tcMar>
-              <w:top w:w="90" w:type="dxa"/>
-              <w:start w:w="90" w:type="dxa"/>
-              <w:bottom w:w="90" w:type="dxa"/>
-              <w:end w:w="90" w:type="dxa"/>
-            </w:tcMar>
-            <w:shd w:fill="F2F2F2"/>
-            <w:vAlign w:val="center"/>
-          </w:tcPr>
-          <w:p>
-            <w:pPr>
-              <w:spacing w:after="0" w:before="0"/>
-              <w:jc w:val="left"/>
-            </w:pPr>
-            <w:r/>
-            <w:r>
-              <w:rPr>
-                <w:rFonts w:ascii="Arial" w:hAnsi="Arial"/>
-                <w:b w:val="0"/>
-                <w:sz w:val="16"/>
-              </w:rPr>
-              <w:t>grep version)</w:t>
-            </w:r>
-          </w:p>
-        </w:tc>
-        <w:tc>
-          <w:tcPr>
-            <w:tcW w:type="dxa" w:w="3311"/>
+              <w:t>Versión de MoveIt (ros2 pkg xml moveit_ros_move_group | grep version)</w:t>
+            </w:r>
+          </w:p>
+        </w:tc>
+        <w:tc>
+          <w:tcPr>
+            <w:tcW w:type="dxa" w:w="4286"/>
             <w:tcMar>
               <w:top w:w="90" w:type="dxa"/>
               <w:start w:w="90" w:type="dxa"/>
@@ -10232,7 +10153,7 @@
         </w:trPr>
         <w:tc>
           <w:tcPr>
-            <w:tcW w:type="dxa" w:w="4139"/>
+            <w:tcW w:type="dxa" w:w="5352"/>
             <w:tcMar>
               <w:top w:w="90" w:type="dxa"/>
               <w:start w:w="90" w:type="dxa"/>
@@ -10259,33 +10180,7 @@
         </w:tc>
         <w:tc>
           <w:tcPr>
-            <w:tcW w:type="dxa" w:w="2194"/>
-            <w:tcMar>
-              <w:top w:w="90" w:type="dxa"/>
-              <w:start w:w="90" w:type="dxa"/>
-              <w:bottom w:w="90" w:type="dxa"/>
-              <w:end w:w="90" w:type="dxa"/>
-            </w:tcMar>
-            <w:vAlign w:val="center"/>
-          </w:tcPr>
-          <w:p>
-            <w:pPr>
-              <w:spacing w:after="0" w:before="0"/>
-              <w:jc w:val="left"/>
-            </w:pPr>
-            <w:r/>
-            <w:r>
-              <w:rPr>
-                <w:rFonts w:ascii="Arial" w:hAnsi="Arial"/>
-                <w:b w:val="0"/>
-                <w:sz w:val="16"/>
-              </w:rPr>
-            </w:r>
-          </w:p>
-        </w:tc>
-        <w:tc>
-          <w:tcPr>
-            <w:tcW w:type="dxa" w:w="3311"/>
+            <w:tcW w:type="dxa" w:w="4286"/>
             <w:tcMar>
               <w:top w:w="90" w:type="dxa"/>
               <w:start w:w="90" w:type="dxa"/>
@@ -10316,7 +10211,7 @@
         </w:trPr>
         <w:tc>
           <w:tcPr>
-            <w:tcW w:type="dxa" w:w="4139"/>
+            <w:tcW w:type="dxa" w:w="5352"/>
             <w:tcMar>
               <w:top w:w="90" w:type="dxa"/>
               <w:start w:w="90" w:type="dxa"/>
@@ -10344,34 +10239,7 @@
         </w:tc>
         <w:tc>
           <w:tcPr>
-            <w:tcW w:type="dxa" w:w="2194"/>
-            <w:tcMar>
-              <w:top w:w="90" w:type="dxa"/>
-              <w:start w:w="90" w:type="dxa"/>
-              <w:bottom w:w="90" w:type="dxa"/>
-              <w:end w:w="90" w:type="dxa"/>
-            </w:tcMar>
-            <w:shd w:fill="F2F2F2"/>
-            <w:vAlign w:val="center"/>
-          </w:tcPr>
-          <w:p>
-            <w:pPr>
-              <w:spacing w:after="0" w:before="0"/>
-              <w:jc w:val="left"/>
-            </w:pPr>
-            <w:r/>
-            <w:r>
-              <w:rPr>
-                <w:rFonts w:ascii="Arial" w:hAnsi="Arial"/>
-                <w:b w:val="0"/>
-                <w:sz w:val="16"/>
-              </w:rPr>
-            </w:r>
-          </w:p>
-        </w:tc>
-        <w:tc>
-          <w:tcPr>
-            <w:tcW w:type="dxa" w:w="3311"/>
+            <w:tcW w:type="dxa" w:w="4286"/>
             <w:tcMar>
               <w:top w:w="90" w:type="dxa"/>
               <w:start w:w="90" w:type="dxa"/>
@@ -12276,6 +12144,7 @@
                 <w:color w:val="FFFFFF"/>
                 <w:sz w:val="15"/>
               </w:rPr>
+              <w:t>N.º</w:t>
             </w:r>
           </w:p>
         </w:tc>

</xml_diff>

<commit_message>
docs(lab04): aviso de sincronizar con la base del curso al inicio de la guía
Igual que en los talleres, la guía del Laboratorio 04 empieza con el aviso
de sincronizar el repositorio privado del equipo con la base del curso, y
la Fase 0 enlaza la guía de sincronización. El conversor Markdown -> Word
de las guías ahora escribe los avisos previos a la sección 1, que antes
descartaba; la guía IA 01 no cambia.

Co-Authored-By: Claude Opus 5.5 <noreply@anthropic.com>
Claude-Session: https://claude.ai/code/session_01A4jArrxa1RLtDdQTQFnPXP
</commit_message>
<xml_diff>
--- a/education/guias_laboratorio/GUIA_LAB_04_MOVEIT2_EJECUCION_SEGURA.docx
+++ b/education/guias_laboratorio/GUIA_LAB_04_MOVEIT2_EJECUCION_SEGURA.docx
@@ -982,6 +982,7 @@
                 <w:b w:val="0"/>
                 <w:sz w:val="16"/>
               </w:rPr>
+              <w:t>Aviso de sincronización con la base del curso</w:t>
             </w:r>
           </w:p>
         </w:tc>
@@ -1011,6 +1012,7 @@
                 <w:b w:val="0"/>
                 <w:sz w:val="16"/>
               </w:rPr>
+              <w:t>Igual que en los talleres, la guía empieza recordando sincronizar el repositorio privado del equipo con la base del curso (base-latest) antes del laboratorio.</w:t>
             </w:r>
           </w:p>
         </w:tc>
@@ -1041,6 +1043,7 @@
                 <w:b w:val="0"/>
                 <w:sz w:val="16"/>
               </w:rPr>
+              <w:t>21/10/2026</w:t>
             </w:r>
           </w:p>
         </w:tc>
@@ -1810,6 +1813,69 @@
           <w:sz w:val="18"/>
         </w:rPr>
         <w:t>VIII – IX</w:t>
+      </w:r>
+    </w:p>
+    <w:tbl>
+      <w:tblPr>
+        <w:tblW w:type="auto" w:w="0"/>
+        <w:jc w:val="center"/>
+        <w:tblLook w:firstColumn="1" w:firstRow="1" w:lastColumn="0" w:lastRow="0" w:noHBand="0" w:noVBand="1" w:val="04A0"/>
+      </w:tblPr>
+      <w:tblGrid>
+        <w:gridCol w:w="8840"/>
+      </w:tblGrid>
+      <w:tr>
+        <w:tc>
+          <w:tcPr>
+            <w:tcW w:type="dxa" w:w="8840"/>
+            <w:shd w:fill="D9EAF7"/>
+            <w:tcMar>
+              <w:top w:w="120" w:type="dxa"/>
+              <w:start w:w="140" w:type="dxa"/>
+              <w:bottom w:w="120" w:type="dxa"/>
+              <w:end w:w="140" w:type="dxa"/>
+            </w:tcMar>
+          </w:tcPr>
+          <w:p>
+            <w:pPr>
+              <w:spacing w:after="0"/>
+            </w:pPr>
+            <w:r/>
+            <w:r>
+              <w:rPr>
+                <w:rFonts w:ascii="Arial" w:hAnsi="Arial"/>
+                <w:b/>
+                <w:sz w:val="16"/>
+              </w:rPr>
+              <w:t xml:space="preserve">IMPORTANTE: </w:t>
+            </w:r>
+            <w:r>
+              <w:rPr>
+                <w:rFonts w:ascii="Arial" w:hAnsi="Arial"/>
+                <w:sz w:val="16"/>
+              </w:rPr>
+              <w:t>Actualización del Repositorio Privado del Equipo:</w:t>
+              <w:br/>
+              <w:t>Antes de iniciar o continuar con este laboratorio, asegúrese de haber sincronizado su repositorio privado de equipo con los últimos cambios de la base del curso. Consulte la Guía Oficial de Sincronización y Actualizaciones (education/proyectos_evaluables/ACTUALIZACIONES_BASE_CORTE_1.md) para realizar este proceso correctamente.</w:t>
+            </w:r>
+          </w:p>
+        </w:tc>
+      </w:tr>
+    </w:tbl>
+    <w:p>
+      <w:pPr>
+        <w:keepNext w:val="0"/>
+        <w:spacing w:before="0" w:after="80" w:line="240" w:lineRule="auto"/>
+        <w:ind w:left="0" w:firstLine="0"/>
+        <w:jc w:val="both"/>
+      </w:pPr>
+      <w:r>
+        <w:rPr>
+          <w:rFonts w:ascii="Arial" w:hAnsi="Arial"/>
+          <w:b w:val="0"/>
+          <w:i w:val="0"/>
+          <w:sz w:val="4"/>
+        </w:rPr>
       </w:r>
     </w:p>
     <w:p>
@@ -7395,7 +7461,7 @@
           <w:i w:val="0"/>
           <w:sz w:val="18"/>
         </w:rPr>
-        <w:t>1. Actualice el repositorio del grupo con la base del curso y compile:</w:t>
+        <w:t>1. Actualice el repositorio del grupo con la base del curso (Guía de Sincronización) y compile:</w:t>
       </w:r>
     </w:p>
     <w:tbl>

</xml_diff>